<commit_message>
hide date2 for postclock
</commit_message>
<xml_diff>
--- a/frontend/public/templates/postClockRequest.docx
+++ b/frontend/public/templates/postClockRequest.docx
@@ -113,8 +113,6 @@
               </w:rPr>
               <w:t>YY</w:t>
             </w:r>
-            <w:bookmarkStart w:id="0" w:name="_GoBack"/>
-            <w:bookmarkEnd w:id="0"/>
             <w:r>
               <w:rPr>
                 <w:rFonts w:ascii="標楷體" w:eastAsia="標楷體" w:hAnsi="標楷體"/>
@@ -480,6 +478,14 @@
               </w:rPr>
               <w:t>}</w:t>
             </w:r>
+            <w:r>
+              <w:rPr>
+                <w:rFonts w:ascii="標楷體" w:eastAsia="標楷體" w:hAnsi="標楷體"/>
+              </w:rPr>
+              <w:t>{time2}</w:t>
+            </w:r>
+            <w:bookmarkStart w:id="0" w:name="_GoBack"/>
+            <w:bookmarkEnd w:id="0"/>
           </w:p>
         </w:tc>
       </w:tr>

</xml_diff>